<commit_message>
docs(qntr): complete baseline refs in v3, record Prashar email sent, update wiki
- v3: Weill & Ross (2004) and Brown & Grant (2005) baseline refs completed from
  verified sources (OpenLibrary: HBS Press; Crossref: full Brown & Grant title +
  CAIS vol 15). Removed the 'not in loaded sources' caveat. Regenerated docx.
- Recorded the 2026-08-05 sent email sharing v3 as a Google Doc (commenter access).
- prof-prashar entity: new comm-history entry; 06-27 user-owed action resolved,
  now PRASHAR-OWED (awaiting his Doc comments + path agreement); dates bumped.
- wiki _index: recently-updated + last-updated refreshed.
</commit_message>
<xml_diff>
--- a/src/research_assistant/spaces/QNTR/output/qntr-candidate-dimensions-prashar-jul2026_v3.docx
+++ b/src/research_assistant/spaces/QNTR/output/qntr-candidate-dimensions-prashar-jul2026_v3.docx
@@ -1100,7 +1100,20 @@
         </w:numPr>
       </w:pPr>
       <w:r>
-        <w:t xml:space="preserve">Eulerich, M., Waddoups, N., Wagener, M., &amp; Wood, D. A. (2024). The Dark Side of Robotic Process Automation. SSRN working paper.</w:t>
+        <w:t xml:space="preserve">Brown, A. E., &amp; Grant, G. G. (2005). Framing the Frameworks: A Review of IT Governance Research.</w:t>
+      </w:r>
+      <w:r>
+        <w:t xml:space="preserve"> </w:t>
+      </w:r>
+      <w:r>
+        <w:rPr>
+          <w:i/>
+          <w:iCs/>
+        </w:rPr>
+        <w:t xml:space="preserve">Communications of the Association for Information Systems</w:t>
+      </w:r>
+      <w:r>
+        <w:t xml:space="preserve">, 15.</w:t>
       </w:r>
     </w:p>
     <w:p>
@@ -1112,6 +1125,18 @@
         </w:numPr>
       </w:pPr>
       <w:r>
+        <w:t xml:space="preserve">Eulerich, M., Waddoups, N., Wagener, M., &amp; Wood, D. A. (2024). The Dark Side of Robotic Process Automation. SSRN working paper.</w:t>
+      </w:r>
+    </w:p>
+    <w:p>
+      <w:pPr>
+        <w:pStyle w:val="Compact"/>
+        <w:numPr>
+          <w:ilvl w:val="0"/>
+          <w:numId w:val="1001"/>
+        </w:numPr>
+      </w:pPr>
+      <w:r>
         <w:t xml:space="preserve">Haase, J., Kremser, W., Leopold, H., Mendling, J., Onnasch, L., &amp; Plattfaut, R. (2024). Interdisciplinary Directions for Researching the Effects of Robotic Process Automation and Large Language Models on Business Processes.</w:t>
       </w:r>
       <w:r>
@@ -1330,34 +1355,14 @@
     </w:p>
     <w:p>
       <w:pPr>
-        <w:pStyle w:val="FirstParagraph"/>
-      </w:pPr>
-      <w:r>
-        <w:t xml:space="preserve">The two IT-governance baseline references come from the technology-adoption review, which captured author, year, and venue but not full titles. They are left as sourced rather than completed from memory:</w:t>
-      </w:r>
-    </w:p>
-    <w:p>
-      <w:pPr>
         <w:pStyle w:val="Compact"/>
         <w:numPr>
           <w:ilvl w:val="0"/>
-          <w:numId w:val="1002"/>
+          <w:numId w:val="1001"/>
         </w:numPr>
       </w:pPr>
       <w:r>
-        <w:t xml:space="preserve">Weill, P., &amp; Ross, J. W. (2004). IT Governance. Book. [Full title and publisher not in the loaded sources.]</w:t>
-      </w:r>
-    </w:p>
-    <w:p>
-      <w:pPr>
-        <w:pStyle w:val="Compact"/>
-        <w:numPr>
-          <w:ilvl w:val="0"/>
-          <w:numId w:val="1002"/>
-        </w:numPr>
-      </w:pPr>
-      <w:r>
-        <w:t xml:space="preserve">Brown, A. E., &amp; Grant, G. G. (2005).</w:t>
+        <w:t xml:space="preserve">Weill, P., &amp; Ross, J. W. (2004).</w:t>
       </w:r>
       <w:r>
         <w:t xml:space="preserve"> </w:t>
@@ -1367,10 +1372,10 @@
           <w:i/>
           <w:iCs/>
         </w:rPr>
-        <w:t xml:space="preserve">Communications of the AIS</w:t>
-      </w:r>
-      <w:r>
-        <w:t xml:space="preserve">. [Title not in the loaded sources.]</w:t>
+        <w:t xml:space="preserve">IT Governance</w:t>
+      </w:r>
+      <w:r>
+        <w:t xml:space="preserve">. Harvard Business School Press.</w:t>
       </w:r>
     </w:p>
     <w:bookmarkEnd w:id="20"/>
@@ -1592,9 +1597,6 @@
     <w:abstractNumId w:val="990"/>
   </w:num>
   <w:num w:numId="1001">
-    <w:abstractNumId w:val="991"/>
-  </w:num>
-  <w:num w:numId="1002">
     <w:abstractNumId w:val="991"/>
   </w:num>
 </w:numbering>

</xml_diff>